<commit_message>
fix(docx): fix OMML equation handling and improve type safety (#3381)
* fix(docx): handle missing chr attribute in groupChr OMML elements

Signed-off-by: Cesar Berrospi Ramis <ceb@zurich.ibm.com>

* fix(docx): escape spaces in OMML limit text for proper LaTeX rendering

Signed-off-by: Cesar Berrospi Ramis <ceb@zurich.ibm.com>

* fix(docx): fix inline equation reconstruction to prevent tag corruption

Signed-off-by: Cesar Berrospi Ramis <ceb@zurich.ibm.com>

* chore(docx): add type hints and docstrings to OMML module

Signed-off-by: Cesar Berrospi Ramis <ceb@zurich.ibm.com>

* fix(docx): fix genfrac formatting and eliminate grouping function warnings

Signed-off-by: Cesar Berrospi Ramis <ceb@zurich.ibm.com>

* fix(docx): handle unmapped characters in OMML % formatting

Signed-off-by: Cesar Berrospi Ramis <ceb@zurich.ibm.com>

---------

Signed-off-by: Cesar Berrospi Ramis <ceb@zurich.ibm.com>
</commit_message>
<xml_diff>
--- a/tests/data/docx/equations.docx
+++ b/tests/data/docx/equations.docx
@@ -1294,52 +1294,152 @@
       </w:r>
       <w:proofErr w:type="gramEnd"/>
       <w:r>
-        <w:t xml:space="preserve"> and this is an inline equation: </w:t>
+        <w:t xml:space="preserve"> and </w:t>
+      </w:r>
+      <w:r>
+        <w:t>these are</w:t>
+      </w:r>
+      <w:r>
+        <w:t xml:space="preserve"> inline equation</w:t>
+      </w:r>
+      <w:r>
+        <w:t>s</w:t>
+      </w:r>
+      <w:r>
+        <w:t>:</w:t>
+      </w:r>
+      <w:r>
+        <w:t xml:space="preserve"> </w:t>
       </w:r>
       <m:oMath>
-        <m:r>
-          <w:rPr>
-            <w:rFonts w:ascii="Cambria Math" w:hAnsi="Cambria Math"/>
-          </w:rPr>
-          <m:t>A=π</m:t>
-        </m:r>
-        <m:sSup>
-          <m:sSupPr>
+        <m:sSubSup>
+          <m:sSubSupPr>
             <m:ctrlPr>
               <w:rPr>
-                <w:rFonts w:ascii="Cambria Math" w:hAnsi="Cambria Math"/>
+                <w:rFonts w:ascii="Cambria Math" w:eastAsia="Arial" w:hAnsi="Cambria Math" w:cs="Times New Roman"/>
+                <w:i/>
+                <w:sz w:val="22"/>
+                <w:szCs w:val="22"/>
               </w:rPr>
             </m:ctrlPr>
-          </m:sSupPr>
+          </m:sSubSupPr>
           <m:e>
             <m:r>
               <w:rPr>
-                <w:rFonts w:ascii="Cambria Math" w:hAnsi="Cambria Math"/>
+                <w:rFonts w:ascii="Cambria Math" w:eastAsia="Arial" w:hAnsi="Cambria Math" w:cs="Times New Roman"/>
+                <w:sz w:val="22"/>
+                <w:szCs w:val="22"/>
               </w:rPr>
-              <m:t>r</m:t>
+              <m:t>N</m:t>
             </m:r>
           </m:e>
+          <m:sub>
+            <m:r>
+              <m:rPr>
+                <m:nor/>
+              </m:rPr>
+              <w:rPr>
+                <w:rFonts w:ascii="Times New Roman" w:eastAsia="Arial" w:hAnsi="Times New Roman" w:cs="Times New Roman"/>
+                <w:i/>
+                <w:sz w:val="22"/>
+                <w:szCs w:val="22"/>
+              </w:rPr>
+              <m:t>s</m:t>
+            </m:r>
+          </m:sub>
+          <m:sup>
+            <m:r>
+              <m:rPr>
+                <m:nor/>
+              </m:rPr>
+              <w:rPr>
+                <w:rFonts w:ascii="Times New Roman" w:eastAsia="Arial" w:hAnsi="Times New Roman" w:cs="Times New Roman"/>
+                <w:i/>
+                <w:sz w:val="22"/>
+                <w:szCs w:val="22"/>
+              </w:rPr>
+              <m:t>H</m:t>
+            </m:r>
+          </m:sup>
+        </m:sSubSup>
+      </m:oMath>
+      <w:r>
+        <w:rPr>
+          <w:rFonts w:ascii="Times New Roman" w:eastAsia="Arial" w:hAnsi="Times New Roman" w:cs="Times New Roman"/>
+          <w:sz w:val="22"/>
+          <w:szCs w:val="22"/>
+        </w:rPr>
+        <w:t>/</w:t>
+      </w:r>
+      <m:oMath>
+        <m:sSubSup>
+          <m:sSubSupPr>
+            <m:ctrlPr>
+              <w:rPr>
+                <w:rFonts w:ascii="Cambria Math" w:eastAsia="Arial" w:hAnsi="Cambria Math" w:cs="Times New Roman"/>
+                <w:i/>
+                <w:sz w:val="22"/>
+                <w:szCs w:val="22"/>
+              </w:rPr>
+            </m:ctrlPr>
+          </m:sSubSupPr>
+          <m:e>
+            <m:r>
+              <w:rPr>
+                <w:rFonts w:ascii="Cambria Math" w:eastAsia="Arial" w:hAnsi="Cambria Math" w:cs="Times New Roman"/>
+                <w:sz w:val="22"/>
+                <w:szCs w:val="22"/>
+              </w:rPr>
+              <m:t>N</m:t>
+            </m:r>
+          </m:e>
+          <m:sub>
+            <m:r>
+              <w:rPr>
+                <w:rFonts w:ascii="Cambria Math" w:eastAsia="Arial" w:hAnsi="Cambria Math" w:cs="Times New Roman"/>
+                <w:sz w:val="22"/>
+                <w:szCs w:val="22"/>
+              </w:rPr>
+              <m:t>s</m:t>
+            </m:r>
+          </m:sub>
           <m:sup>
             <m:r>
               <w:rPr>
-                <w:rFonts w:ascii="Cambria Math" w:hAnsi="Cambria Math"/>
+                <w:rFonts w:ascii="Cambria Math" w:eastAsia="Arial" w:hAnsi="Cambria Math" w:cs="Times New Roman"/>
+                <w:sz w:val="22"/>
+                <w:szCs w:val="22"/>
               </w:rPr>
-              <m:t>2</m:t>
+              <m:t>P</m:t>
             </m:r>
           </m:sup>
-        </m:sSup>
-        <m:r>
-          <w:rPr>
-            <w:rFonts w:ascii="Cambria Math" w:hAnsi="Cambria Math"/>
-          </w:rPr>
-          <m:t xml:space="preserve"> </m:t>
-        </m:r>
+        </m:sSubSup>
       </m:oMath>
       <w:r>
         <w:rPr>
-          <w:rFonts w:eastAsiaTheme="minorEastAsia"/>
-        </w:rPr>
-        <w:t>. If instead, I want an equation by line, I can do this:</w:t>
+          <w:rFonts w:ascii="Times New Roman" w:eastAsia="Arial" w:hAnsi="Times New Roman" w:cs="Times New Roman"/>
+          <w:sz w:val="22"/>
+          <w:szCs w:val="22"/>
+        </w:rPr>
+        <w:t>​</w:t>
+      </w:r>
+      <w:r>
+        <w:rPr>
+          <w:rFonts w:eastAsiaTheme="minorEastAsia"/>
+        </w:rPr>
+        <w:t>.</w:t>
+      </w:r>
+      <w:r>
+        <w:rPr>
+          <w:rFonts w:eastAsiaTheme="minorEastAsia"/>
+        </w:rPr>
+        <w:t xml:space="preserve"> </w:t>
+      </w:r>
+      <w:r>
+        <w:rPr>
+          <w:rFonts w:eastAsiaTheme="minorEastAsia"/>
+        </w:rPr>
+        <w:t>If instead, I want an equation by line, I can do this:</w:t>
       </w:r>
     </w:p>
     <w:p>
@@ -2655,6 +2755,491 @@
           </m:func>
         </m:oMath>
       </m:oMathPara>
+    </w:p>
+    <w:p>
+      <w:pPr>
+        <w:rPr>
+          <w:rFonts w:eastAsiaTheme="minorEastAsia"/>
+        </w:rPr>
+      </w:pPr>
+    </w:p>
+    <w:p>
+      <w:pPr>
+        <w:rPr>
+          <w:rFonts w:eastAsiaTheme="minorEastAsia"/>
+        </w:rPr>
+      </w:pPr>
+    </w:p>
+    <w:p>
+      <w:r>
+        <w:rPr>
+          <w:rFonts w:eastAsiaTheme="minorEastAsia"/>
+        </w:rPr>
+        <w:t>Equations with the OMML g</w:t>
+      </w:r>
+      <w:r>
+        <w:t>roup character object:</w:t>
+      </w:r>
+    </w:p>
+    <w:p/>
+    <w:p>
+      <w:pPr>
+        <w:spacing w:after="100"/>
+        <w:jc w:val="both"/>
+        <w:rPr>
+          <w:rFonts w:ascii="Times New Roman" w:eastAsia="Arial" w:hAnsi="Times New Roman" w:cs="Times New Roman"/>
+        </w:rPr>
+      </w:pPr>
+      <m:oMathPara>
+        <m:oMathParaPr>
+          <m:jc m:val="center"/>
+        </m:oMathParaPr>
+        <m:oMath>
+          <m:sSub>
+            <m:sSubPr>
+              <m:ctrlPr>
+                <w:rPr>
+                  <w:rFonts w:ascii="Cambria Math" w:eastAsia="Arial" w:hAnsi="Cambria Math" w:cs="Times New Roman"/>
+                  <w:i/>
+                  <w:sz w:val="22"/>
+                  <w:szCs w:val="22"/>
+                </w:rPr>
+              </m:ctrlPr>
+            </m:sSubPr>
+            <m:e>
+              <m:r>
+                <w:rPr>
+                  <w:rFonts w:ascii="Cambria Math" w:eastAsia="Arial" w:hAnsi="Cambria Math" w:cs="Times New Roman"/>
+                  <w:sz w:val="22"/>
+                  <w:szCs w:val="22"/>
+                </w:rPr>
+                <m:t>P</m:t>
+              </m:r>
+            </m:e>
+            <m:sub>
+              <m:r>
+                <m:rPr>
+                  <m:nor/>
+                </m:rPr>
+                <w:rPr>
+                  <w:rFonts w:ascii="Cambria Math" w:eastAsia="Arial" w:hAnsi="Times New Roman" w:cs="Times New Roman"/>
+                  <w:i/>
+                  <w:sz w:val="22"/>
+                  <w:szCs w:val="22"/>
+                </w:rPr>
+                <m:t xml:space="preserve"> </m:t>
+              </m:r>
+              <m:r>
+                <m:rPr>
+                  <m:nor/>
+                </m:rPr>
+                <w:rPr>
+                  <w:rFonts w:ascii="Times New Roman" w:eastAsia="Arial" w:hAnsi="Times New Roman" w:cs="Times New Roman"/>
+                  <w:i/>
+                  <w:sz w:val="22"/>
+                  <w:szCs w:val="22"/>
+                </w:rPr>
+                <m:t>x</m:t>
+              </m:r>
+            </m:sub>
+          </m:sSub>
+          <m:r>
+            <w:rPr>
+              <w:rFonts w:ascii="Cambria Math" w:eastAsia="Arial" w:hAnsi="Cambria Math" w:cs="Times New Roman"/>
+              <w:sz w:val="22"/>
+              <w:szCs w:val="22"/>
+            </w:rPr>
+            <m:t>=</m:t>
+          </m:r>
+          <m:limLow>
+            <m:limLowPr>
+              <m:ctrlPr>
+                <w:rPr>
+                  <w:rFonts w:ascii="Cambria Math" w:eastAsia="Arial" w:hAnsi="Cambria Math" w:cs="Times New Roman"/>
+                  <w:i/>
+                  <w:sz w:val="22"/>
+                  <w:szCs w:val="22"/>
+                </w:rPr>
+              </m:ctrlPr>
+            </m:limLowPr>
+            <m:e>
+              <m:groupChr>
+                <m:groupChrPr>
+                  <m:ctrlPr>
+                    <w:rPr>
+                      <w:rFonts w:ascii="Cambria Math" w:eastAsia="Arial" w:hAnsi="Cambria Math" w:cs="Times New Roman"/>
+                      <w:i/>
+                      <w:sz w:val="22"/>
+                      <w:szCs w:val="22"/>
+                    </w:rPr>
+                  </m:ctrlPr>
+                </m:groupChrPr>
+                <m:e>
+                  <m:r>
+                    <w:rPr>
+                      <w:rFonts w:ascii="Cambria Math" w:eastAsia="Arial" w:hAnsi="Cambria Math" w:cs="Times New Roman"/>
+                      <w:sz w:val="22"/>
+                      <w:szCs w:val="22"/>
+                    </w:rPr>
+                    <m:t>S⋅</m:t>
+                  </m:r>
+                  <m:r>
+                    <w:rPr>
+                      <w:rFonts w:ascii="Cambria Math" w:eastAsia="Arial" w:hAnsi="Cambria Math" w:cs="Times New Roman"/>
+                      <w:sz w:val="22"/>
+                      <w:szCs w:val="22"/>
+                      <w:lang w:val="fr-CH"/>
+                    </w:rPr>
+                    <m:t>T</m:t>
+                  </m:r>
+                  <m:r>
+                    <w:rPr>
+                      <w:rFonts w:ascii="Cambria Math" w:eastAsia="Arial" w:hAnsi="Cambria Math" w:cs="Times New Roman"/>
+                      <w:sz w:val="22"/>
+                      <w:szCs w:val="22"/>
+                    </w:rPr>
+                    <m:t>⋅</m:t>
+                  </m:r>
+                  <m:r>
+                    <w:rPr>
+                      <w:rFonts w:ascii="Cambria Math" w:eastAsia="Arial" w:hAnsi="Cambria Math" w:cs="Times New Roman"/>
+                      <w:sz w:val="22"/>
+                      <w:szCs w:val="22"/>
+                      <w:lang w:val="fr-CH"/>
+                    </w:rPr>
+                    <m:t>G</m:t>
+                  </m:r>
+                  <m:r>
+                    <w:rPr>
+                      <w:rFonts w:ascii="Cambria Math" w:eastAsia="Arial" w:hAnsi="Cambria Math" w:cs="Times New Roman"/>
+                      <w:sz w:val="22"/>
+                      <w:szCs w:val="22"/>
+                    </w:rPr>
+                    <m:t>⋅(x+y+z)</m:t>
+                  </m:r>
+                </m:e>
+              </m:groupChr>
+            </m:e>
+            <m:lim>
+              <m:r>
+                <w:rPr>
+                  <w:rFonts w:ascii="Cambria Math" w:eastAsia="Arial" w:hAnsi="Cambria Math" w:cs="Times New Roman"/>
+                  <w:sz w:val="22"/>
+                  <w:szCs w:val="22"/>
+                </w:rPr>
+                <m:t xml:space="preserve">group </m:t>
+              </m:r>
+              <m:r>
+                <w:rPr>
+                  <w:rFonts w:ascii="Cambria Math" w:eastAsia="Arial" w:hAnsi="Cambria Math" w:cs="Times New Roman"/>
+                  <w:sz w:val="22"/>
+                  <w:szCs w:val="22"/>
+                  <w:lang w:val="fr-CH"/>
+                </w:rPr>
+                <m:t>wit</m:t>
+              </m:r>
+              <m:r>
+                <w:rPr>
+                  <w:rFonts w:ascii="Cambria Math" w:eastAsia="Arial" w:hAnsi="Cambria Math" w:cs="Times New Roman"/>
+                  <w:sz w:val="22"/>
+                  <w:szCs w:val="22"/>
+                </w:rPr>
+                <m:t xml:space="preserve">h </m:t>
+              </m:r>
+              <m:r>
+                <w:rPr>
+                  <w:rFonts w:ascii="Cambria Math" w:eastAsia="Arial" w:hAnsi="Cambria Math" w:cs="Times New Roman"/>
+                  <w:sz w:val="22"/>
+                  <w:szCs w:val="22"/>
+                  <w:lang w:val="fr-CH"/>
+                </w:rPr>
+                <m:t>underbraces</m:t>
+              </m:r>
+            </m:lim>
+          </m:limLow>
+          <m:r>
+            <w:rPr>
+              <w:rFonts w:ascii="Cambria Math" w:eastAsia="Arial" w:hAnsi="Cambria Math" w:cs="Times New Roman"/>
+              <w:sz w:val="22"/>
+              <w:szCs w:val="22"/>
+            </w:rPr>
+            <m:t>+</m:t>
+          </m:r>
+          <m:sSup>
+            <m:sSupPr>
+              <m:ctrlPr>
+                <w:rPr>
+                  <w:rFonts w:ascii="Cambria Math" w:eastAsiaTheme="minorEastAsia" w:hAnsi="Cambria Math"/>
+                </w:rPr>
+              </m:ctrlPr>
+            </m:sSupPr>
+            <m:e>
+              <m:r>
+                <w:rPr>
+                  <w:rFonts w:ascii="Cambria Math" w:eastAsiaTheme="minorEastAsia" w:hAnsi="Cambria Math"/>
+                </w:rPr>
+                <m:t>e</m:t>
+              </m:r>
+            </m:e>
+            <m:sup>
+              <m:r>
+                <w:rPr>
+                  <w:rFonts w:ascii="Cambria Math" w:eastAsiaTheme="minorEastAsia" w:hAnsi="Cambria Math"/>
+                </w:rPr>
+                <m:t>x</m:t>
+              </m:r>
+            </m:sup>
+          </m:sSup>
+        </m:oMath>
+      </m:oMathPara>
+    </w:p>
+    <w:p>
+      <w:pPr>
+        <w:spacing w:after="100"/>
+        <w:jc w:val="both"/>
+        <w:rPr>
+          <w:rFonts w:ascii="Times New Roman" w:eastAsia="Arial" w:hAnsi="Times New Roman" w:cs="Times New Roman"/>
+          <w:lang w:val="fr-CH"/>
+        </w:rPr>
+      </w:pPr>
+      <m:oMathPara>
+        <m:oMathParaPr>
+          <m:jc m:val="center"/>
+        </m:oMathParaPr>
+        <m:oMath>
+          <m:sSub>
+            <m:sSubPr>
+              <m:ctrlPr>
+                <w:rPr>
+                  <w:rFonts w:ascii="Cambria Math" w:eastAsia="Arial" w:hAnsi="Cambria Math" w:cs="Times New Roman"/>
+                  <w:i/>
+                  <w:sz w:val="22"/>
+                  <w:szCs w:val="22"/>
+                </w:rPr>
+              </m:ctrlPr>
+            </m:sSubPr>
+            <m:e>
+              <m:r>
+                <w:rPr>
+                  <w:rFonts w:ascii="Cambria Math" w:eastAsia="Arial" w:hAnsi="Cambria Math" w:cs="Times New Roman"/>
+                  <w:sz w:val="22"/>
+                  <w:szCs w:val="22"/>
+                </w:rPr>
+                <m:t>Q</m:t>
+              </m:r>
+            </m:e>
+            <m:sub>
+              <m:r>
+                <m:rPr>
+                  <m:nor/>
+                </m:rPr>
+                <w:rPr>
+                  <w:rFonts w:ascii="Cambria Math" w:eastAsia="Arial" w:hAnsi="Times New Roman" w:cs="Times New Roman"/>
+                  <w:i/>
+                  <w:sz w:val="22"/>
+                  <w:szCs w:val="22"/>
+                  <w:lang w:val="fr-CH"/>
+                </w:rPr>
+                <m:t xml:space="preserve"> y</m:t>
+              </m:r>
+            </m:sub>
+          </m:sSub>
+          <m:r>
+            <w:rPr>
+              <w:rFonts w:ascii="Cambria Math" w:eastAsia="Arial" w:hAnsi="Cambria Math" w:cs="Times New Roman"/>
+              <w:sz w:val="22"/>
+              <w:szCs w:val="22"/>
+              <w:lang w:val="fr-CH"/>
+            </w:rPr>
+            <m:t>=</m:t>
+          </m:r>
+          <m:limUpp>
+            <m:limUppPr>
+              <m:ctrlPr>
+                <w:rPr>
+                  <w:rFonts w:ascii="Cambria Math" w:eastAsia="Arial" w:hAnsi="Cambria Math" w:cs="Times New Roman"/>
+                  <w:i/>
+                  <w:sz w:val="22"/>
+                  <w:szCs w:val="22"/>
+                </w:rPr>
+              </m:ctrlPr>
+            </m:limUppPr>
+            <m:e>
+              <m:groupChr>
+                <m:groupChrPr>
+                  <m:chr m:val="⏞"/>
+                  <m:pos m:val="top"/>
+                  <m:vertJc m:val="bot"/>
+                  <m:ctrlPr>
+                    <w:rPr>
+                      <w:rFonts w:ascii="Cambria Math" w:eastAsia="Arial" w:hAnsi="Cambria Math" w:cs="Times New Roman"/>
+                      <w:i/>
+                      <w:sz w:val="22"/>
+                      <w:szCs w:val="22"/>
+                    </w:rPr>
+                  </m:ctrlPr>
+                </m:groupChrPr>
+                <m:e>
+                  <m:r>
+                    <w:rPr>
+                      <w:rFonts w:ascii="Cambria Math" w:eastAsia="Arial" w:hAnsi="Cambria Math" w:cs="Times New Roman"/>
+                      <w:sz w:val="22"/>
+                      <w:szCs w:val="22"/>
+                    </w:rPr>
+                    <m:t>G</m:t>
+                  </m:r>
+                  <m:r>
+                    <w:rPr>
+                      <w:rFonts w:ascii="Cambria Math" w:eastAsia="Arial" w:hAnsi="Cambria Math" w:cs="Times New Roman"/>
+                      <w:sz w:val="22"/>
+                      <w:szCs w:val="22"/>
+                      <w:lang w:val="fr-CH"/>
+                    </w:rPr>
+                    <m:t>⋅T⋅S⋅(</m:t>
+                  </m:r>
+                  <m:r>
+                    <w:rPr>
+                      <w:rFonts w:ascii="Cambria Math" w:eastAsia="Arial" w:hAnsi="Cambria Math" w:cs="Times New Roman"/>
+                      <w:sz w:val="22"/>
+                      <w:szCs w:val="22"/>
+                    </w:rPr>
+                    <m:t>x</m:t>
+                  </m:r>
+                  <m:r>
+                    <w:rPr>
+                      <w:rFonts w:ascii="Cambria Math" w:eastAsia="Arial" w:hAnsi="Cambria Math" w:cs="Times New Roman"/>
+                      <w:sz w:val="22"/>
+                      <w:szCs w:val="22"/>
+                      <w:lang w:val="fr-CH"/>
+                    </w:rPr>
+                    <m:t>+</m:t>
+                  </m:r>
+                  <m:r>
+                    <w:rPr>
+                      <w:rFonts w:ascii="Cambria Math" w:eastAsia="Arial" w:hAnsi="Cambria Math" w:cs="Times New Roman"/>
+                      <w:sz w:val="22"/>
+                      <w:szCs w:val="22"/>
+                    </w:rPr>
+                    <m:t>y</m:t>
+                  </m:r>
+                  <m:r>
+                    <w:rPr>
+                      <w:rFonts w:ascii="Cambria Math" w:eastAsia="Arial" w:hAnsi="Cambria Math" w:cs="Times New Roman"/>
+                      <w:sz w:val="22"/>
+                      <w:szCs w:val="22"/>
+                      <w:lang w:val="fr-CH"/>
+                    </w:rPr>
+                    <m:t>+</m:t>
+                  </m:r>
+                  <m:r>
+                    <w:rPr>
+                      <w:rFonts w:ascii="Cambria Math" w:eastAsia="Arial" w:hAnsi="Cambria Math" w:cs="Times New Roman"/>
+                      <w:sz w:val="22"/>
+                      <w:szCs w:val="22"/>
+                    </w:rPr>
+                    <m:t>z</m:t>
+                  </m:r>
+                  <m:r>
+                    <w:rPr>
+                      <w:rFonts w:ascii="Cambria Math" w:eastAsia="Arial" w:hAnsi="Cambria Math" w:cs="Times New Roman"/>
+                      <w:sz w:val="22"/>
+                      <w:szCs w:val="22"/>
+                      <w:lang w:val="fr-CH"/>
+                    </w:rPr>
+                    <m:t>)</m:t>
+                  </m:r>
+                </m:e>
+              </m:groupChr>
+            </m:e>
+            <m:lim>
+              <m:r>
+                <w:rPr>
+                  <w:rFonts w:ascii="Cambria Math" w:eastAsia="Arial" w:hAnsi="Cambria Math" w:cs="Times New Roman"/>
+                  <w:sz w:val="22"/>
+                  <w:szCs w:val="22"/>
+                </w:rPr>
+                <m:t>group</m:t>
+              </m:r>
+              <m:r>
+                <w:rPr>
+                  <w:rFonts w:ascii="Cambria Math" w:eastAsia="Arial" w:hAnsi="Cambria Math" w:cs="Times New Roman"/>
+                  <w:sz w:val="22"/>
+                  <w:szCs w:val="22"/>
+                  <w:lang w:val="fr-CH"/>
+                </w:rPr>
+                <m:t xml:space="preserve"> </m:t>
+              </m:r>
+              <m:r>
+                <w:rPr>
+                  <w:rFonts w:ascii="Cambria Math" w:eastAsia="Arial" w:hAnsi="Cambria Math" w:cs="Times New Roman"/>
+                  <w:sz w:val="22"/>
+                  <w:szCs w:val="22"/>
+                </w:rPr>
+                <m:t>wit</m:t>
+              </m:r>
+              <m:r>
+                <w:rPr>
+                  <w:rFonts w:ascii="Cambria Math" w:eastAsia="Arial" w:hAnsi="Cambria Math" w:cs="Times New Roman"/>
+                  <w:sz w:val="22"/>
+                  <w:szCs w:val="22"/>
+                  <w:lang w:val="fr-CH"/>
+                </w:rPr>
+                <m:t xml:space="preserve">h </m:t>
+              </m:r>
+              <m:r>
+                <w:rPr>
+                  <w:rFonts w:ascii="Cambria Math" w:eastAsia="Arial" w:hAnsi="Cambria Math" w:cs="Times New Roman"/>
+                  <w:sz w:val="22"/>
+                  <w:szCs w:val="22"/>
+                </w:rPr>
+                <m:t>overbraces</m:t>
+              </m:r>
+            </m:lim>
+          </m:limUpp>
+          <m:r>
+            <w:rPr>
+              <w:rFonts w:ascii="Cambria Math" w:eastAsia="Arial" w:hAnsi="Cambria Math" w:cs="Times New Roman"/>
+              <w:sz w:val="22"/>
+              <w:szCs w:val="22"/>
+              <w:lang w:val="fr-CH"/>
+            </w:rPr>
+            <m:t>+</m:t>
+          </m:r>
+          <m:sSup>
+            <m:sSupPr>
+              <m:ctrlPr>
+                <w:rPr>
+                  <w:rFonts w:ascii="Cambria Math" w:eastAsiaTheme="minorEastAsia" w:hAnsi="Cambria Math"/>
+                </w:rPr>
+              </m:ctrlPr>
+            </m:sSupPr>
+            <m:e>
+              <m:r>
+                <w:rPr>
+                  <w:rFonts w:ascii="Cambria Math" w:eastAsiaTheme="minorEastAsia" w:hAnsi="Cambria Math"/>
+                </w:rPr>
+                <m:t>e</m:t>
+              </m:r>
+            </m:e>
+            <m:sup>
+              <m:r>
+                <w:rPr>
+                  <w:rFonts w:ascii="Cambria Math" w:eastAsiaTheme="minorEastAsia" w:hAnsi="Cambria Math"/>
+                </w:rPr>
+                <m:t>y</m:t>
+              </m:r>
+            </m:sup>
+          </m:sSup>
+        </m:oMath>
+      </m:oMathPara>
+    </w:p>
+    <w:p>
+      <w:pPr>
+        <w:rPr>
+          <w:rFonts w:eastAsiaTheme="minorEastAsia"/>
+          <w:lang w:val="fr-CH"/>
+        </w:rPr>
+      </w:pPr>
     </w:p>
     <w:sectPr>
       <w:pgSz w:w="11906" w:h="16838"/>

</xml_diff>